<commit_message>
ISO W10 sapuan Commercial (COM-FRM-01, COM-FRM-02, COM-REG-01) + judul klausul ISO
COM: lolos gerbang mesin dan pemeriksa bahasa buta (semua skor >= 4); label
(USULAN) dibawa ke fakta pengganti rujukan klasifikasi (temuan nonblocking).
Judul klausul ISO di tabel Acuan dan iso_refs dikembalikan ke teks bed1bb6 bila
hanya diubah skrip istilah (w10.py isotitles): judul resmi, bukan istilah kerja.
Dokumen yang sudah lolos dirender ulang dan lolos gerbang mesin lagi.

Co-Authored-By: Claude Opus 5.5 <noreply@anthropic.com>
Claude-Session: https://claude.ai/code/session_01BhkCQM7h3krZb9kjY2Nate
</commit_message>
<xml_diff>
--- a/out/03_FAT/SNX-FAT-RPT-02 FAT Nonconformity & Corrective Action (Rev00 DRAFT).docx
+++ b/out/03_FAT/SNX-FAT-RPT-02 FAT Nonconformity & Corrective Action (Rev00 DRAFT).docx
@@ -11731,7 +11731,7 @@
                 <w:sz w:val="24"/>
                 <w:szCs w:val="24"/>
               </w:rPr>
-              <w:t>10.2 Ketidaksesuaian dan corrective action</w:t>
+              <w:t>10.2 Ketidaksesuaian dan tindakan korektif</w:t>
             </w:r>
           </w:p>
         </w:tc>
@@ -12004,7 +12004,7 @@
                 <w:sz w:val="24"/>
                 <w:szCs w:val="24"/>
               </w:rPr>
-              <w:t>10.2 Ketidaksesuaian dan corrective action</w:t>
+              <w:t>10.2 Ketidaksesuaian dan tindakan korektif</w:t>
             </w:r>
           </w:p>
         </w:tc>
@@ -12095,7 +12095,7 @@
                 <w:sz w:val="24"/>
                 <w:szCs w:val="24"/>
               </w:rPr>
-              <w:t>Annex A 5.33 Perlindungan record</w:t>
+              <w:t>Annex A 5.33 Perlindungan rekaman</w:t>
             </w:r>
           </w:p>
         </w:tc>

</xml_diff>